<commit_message>
Voeg PowerPoint toe en corrigeer de optelling van kamers
De presentatie telt 23 dia's en is volledig opgebouwd uit native
PowerPoint-vormen, tekstkaders en tabellen, zodat elke tekst in
PowerPoint te selecteren en aan te passen is.

Inhoudelijke correctie: de tien kamers van de ICU en de vijftien van
CCU/SCU/EHH zijn verschillende kamers voor verschillende specialismen en
mogen niet worden opgeteld. De berekeningen zijn per specialisme apart
gemaakt op de huidige, gescheiden situatie; in de nieuwbouwscenario's
waarin afdelingen samengaan moet opnieuw geteld worden. Daar is een
aparte dia voor, en het Word-document is op hetzelfde punt aangepast.

preview.py rendert de dia's uit de pptx-geometrie en meldt tekst die
buiten zijn kader valt, omdat LibreOffice hier niet beschikbaar is.

Co-Authored-By: Claude Opus 5 <noreply@anthropic.com>
Claude-Session: https://claude.ai/code/session_01MzaqydkWSKnpLkCvLiaavG
</commit_message>
<xml_diff>
--- a/docs/whiteboard/Acute-poort-en-Hotfloor.docx
+++ b/docs/whiteboard/Acute-poort-en-Hotfloor.docx
@@ -659,12 +659,12 @@
         <w:tblW w:type="auto" w:w="0"/>
         <w:jc w:val="center"/>
         <w:tblBorders>
-          <w:top w:val="single" w:sz="6" w:space="0" w:color="64748B"/>
-          <w:left w:val="single" w:sz="6" w:space="0" w:color="64748B"/>
-          <w:bottom w:val="single" w:sz="6" w:space="0" w:color="64748B"/>
-          <w:right w:val="single" w:sz="6" w:space="0" w:color="64748B"/>
-          <w:insideH w:val="none" w:sz="6" w:space="0" w:color="64748B"/>
-          <w:insideV w:val="none" w:sz="6" w:space="0" w:color="64748B"/>
+          <w:top w:val="single" w:sz="6" w:space="0" w:color="C4392D"/>
+          <w:left w:val="single" w:sz="6" w:space="0" w:color="C4392D"/>
+          <w:bottom w:val="single" w:sz="6" w:space="0" w:color="C4392D"/>
+          <w:right w:val="single" w:sz="6" w:space="0" w:color="C4392D"/>
+          <w:insideH w:val="none" w:sz="6" w:space="0" w:color="C4392D"/>
+          <w:insideV w:val="none" w:sz="6" w:space="0" w:color="C4392D"/>
         </w:tblBorders>
         <w:tblCellMar>
           <w:top w:w="60" w:type="dxa"/>
@@ -681,7 +681,7 @@
         <w:tc>
           <w:tcPr>
             <w:tcW w:type="dxa" w:w="9751"/>
-            <w:shd w:val="clear" w:color="auto" w:fill="F4F7FB"/>
+            <w:shd w:val="clear" w:color="auto" w:fill="FBEDEB"/>
           </w:tcPr>
           <w:p>
             <w:pPr>
@@ -690,10 +690,10 @@
             <w:r>
               <w:rPr>
                 <w:b/>
-                <w:color w:val="64748B"/>
+                <w:color w:val="C4392D"/>
                 <w:sz w:val="16"/>
               </w:rPr>
-              <w:t>NOG TE BEVESTIGEN</w:t>
+              <w:t>LET OP BIJ DE AANTALLEN</w:t>
             </w:r>
           </w:p>
           <w:p>
@@ -705,7 +705,7 @@
                 <w:color w:val="0F1B2D"/>
                 <w:sz w:val="21"/>
               </w:rPr>
-              <w:t>Bij de SEH is niet af te lezen of er een jaarplan ligt, en bij kind spoed ontbreken de gegevens vrijwel helemaal. De kamertallen 10 (ICU) en 15 (CCU/SCU/EHH) zijn de huidige aantallen kamers.</w:t>
+              <w:t>10 en 15 zijn de kamers die ICU en CCU/SCU/EHH nu hebben. Het zijn verschillende kamers voor verschillende specialismen, dus ze zijn niet bij elkaar op te tellen. De berekeningen zijn per specialisme apart gemaakt, op de huidige gescheiden situatie; in de nieuwbouwscenario's waarin afdelingen samengaan moet opnieuw geteld worden. Bij de SEH is niet af te lezen of er een jaarplan ligt, en bij kind spoed ontbreken de gegevens vrijwel helemaal.</w:t>
             </w:r>
           </w:p>
         </w:tc>

</xml_diff>